<commit_message>
fix: harden lesson plan bookmark compatibility
</commit_message>
<xml_diff>
--- a/教案生成器/lesson-plan-docx-generator/assets/templates/lesson-plan/v1.1.0/template.docx
+++ b/教案生成器/lesson-plan-docx-generator/assets/templates/lesson-plan/v1.1.0/template.docx
@@ -5233,7 +5233,7 @@
                 <w:szCs w:val="24"/>
               </w:rPr>
             </w:pPr>
-            <w:bookmarkStart w:id="23" w:name="lp_impl_before_class_preparation_stage"/>
+            <w:bookmarkStart w:id="23" w:name="lp_impl_prep_stage"/>
             <w:r>
               <w:rPr>
                 <w:rFonts w:ascii="仿宋" w:eastAsia="仿宋" w:hAnsi="仿宋" w:hint="eastAsia"/>
@@ -5328,7 +5328,7 @@
                 <w:szCs w:val="24"/>
               </w:rPr>
             </w:pPr>
-            <w:bookmarkStart w:id="24" w:name="lp_impl_before_class_preparation_content"/>
+            <w:bookmarkStart w:id="24" w:name="lp_impl_prep_content"/>
             <w:r>
               <w:rPr>
                 <w:rFonts w:ascii="仿宋" w:eastAsia="仿宋" w:hAnsi="仿宋" w:hint="eastAsia"/>
@@ -5377,7 +5377,7 @@
                 <w:szCs w:val="24"/>
               </w:rPr>
             </w:pPr>
-            <w:bookmarkStart w:id="25" w:name="lp_impl_before_class_preparation_teacher_activity"/>
+            <w:bookmarkStart w:id="25" w:name="lp_impl_prep_teacher"/>
             <w:r>
               <w:rPr>
                 <w:rFonts w:ascii="仿宋" w:eastAsia="仿宋" w:hAnsi="仿宋"/>
@@ -5455,7 +5455,7 @@
                 <w:szCs w:val="24"/>
               </w:rPr>
             </w:pPr>
-            <w:bookmarkStart w:id="26" w:name="lp_impl_before_class_preparation_student_activity"/>
+            <w:bookmarkStart w:id="26" w:name="lp_impl_prep_student"/>
             <w:r>
               <w:rPr>
                 <w:rFonts w:ascii="仿宋" w:eastAsia="仿宋" w:hAnsi="仿宋" w:hint="eastAsia"/>
@@ -5515,7 +5515,7 @@
                 <w:szCs w:val="24"/>
               </w:rPr>
             </w:pPr>
-            <w:bookmarkStart w:id="27" w:name="lp_impl_before_class_preparation_objective"/>
+            <w:bookmarkStart w:id="27" w:name="lp_impl_prep_goal"/>
             <w:r>
               <w:rPr>
                 <w:rFonts w:ascii="仿宋" w:eastAsia="仿宋" w:hAnsi="仿宋" w:hint="eastAsia"/>
@@ -5618,7 +5618,7 @@
                 <w:szCs w:val="24"/>
               </w:rPr>
             </w:pPr>
-            <w:bookmarkStart w:id="28" w:name="lp_impl_task_introduction_stage"/>
+            <w:bookmarkStart w:id="28" w:name="lp_impl_intro_stage"/>
             <w:r>
               <w:rPr>
                 <w:rFonts w:ascii="仿宋" w:eastAsia="仿宋" w:hAnsi="仿宋" w:hint="eastAsia"/>
@@ -5679,7 +5679,7 @@
                 <w:szCs w:val="24"/>
               </w:rPr>
             </w:pPr>
-            <w:bookmarkStart w:id="29" w:name="lp_impl_task_introduction_content"/>
+            <w:bookmarkStart w:id="29" w:name="lp_impl_intro_content"/>
             <w:r>
               <w:rPr>
                 <w:rFonts w:ascii="仿宋" w:eastAsia="仿宋" w:hAnsi="仿宋" w:hint="eastAsia"/>
@@ -5798,7 +5798,7 @@
                 <w:szCs w:val="24"/>
               </w:rPr>
             </w:pPr>
-            <w:bookmarkStart w:id="30" w:name="lp_impl_task_introduction_teacher_activity"/>
+            <w:bookmarkStart w:id="30" w:name="lp_impl_intro_teacher"/>
             <w:r>
               <w:rPr>
                 <w:rFonts w:ascii="仿宋" w:eastAsia="仿宋" w:hAnsi="仿宋" w:hint="eastAsia"/>
@@ -5952,7 +5952,7 @@
                 <w:szCs w:val="24"/>
               </w:rPr>
             </w:pPr>
-            <w:bookmarkStart w:id="31" w:name="lp_impl_task_introduction_student_activity"/>
+            <w:bookmarkStart w:id="31" w:name="lp_impl_intro_student"/>
             <w:r>
               <w:rPr>
                 <w:rFonts w:ascii="仿宋" w:eastAsia="仿宋" w:hAnsi="仿宋" w:hint="eastAsia"/>
@@ -6012,7 +6012,7 @@
                 <w:szCs w:val="24"/>
               </w:rPr>
             </w:pPr>
-            <w:bookmarkStart w:id="32" w:name="lp_impl_task_introduction_objective"/>
+            <w:bookmarkStart w:id="32" w:name="lp_impl_intro_goal"/>
             <w:r>
               <w:rPr>
                 <w:rFonts w:ascii="仿宋" w:eastAsia="仿宋" w:hAnsi="仿宋" w:hint="eastAsia"/>
@@ -6080,7 +6080,7 @@
                 <w:szCs w:val="24"/>
               </w:rPr>
             </w:pPr>
-            <w:bookmarkStart w:id="33" w:name="lp_impl_operation_demonstration_stage"/>
+            <w:bookmarkStart w:id="33" w:name="lp_impl_demo_stage"/>
             <w:r>
               <w:rPr>
                 <w:rFonts w:ascii="仿宋" w:eastAsia="仿宋" w:hAnsi="仿宋" w:hint="eastAsia"/>
@@ -6154,7 +6154,7 @@
                 <w:szCs w:val="24"/>
               </w:rPr>
             </w:pPr>
-            <w:bookmarkStart w:id="34" w:name="lp_impl_operation_demonstration_content"/>
+            <w:bookmarkStart w:id="34" w:name="lp_impl_demo_content"/>
             <w:r>
               <w:rPr>
                 <w:rFonts w:ascii="仿宋" w:eastAsia="仿宋" w:hAnsi="仿宋" w:hint="eastAsia"/>
@@ -6251,7 +6251,7 @@
                 <w:szCs w:val="24"/>
               </w:rPr>
             </w:pPr>
-            <w:bookmarkStart w:id="35" w:name="lp_impl_operation_demonstration_teacher_activity"/>
+            <w:bookmarkStart w:id="35" w:name="lp_impl_demo_teacher"/>
             <w:r>
               <w:rPr>
                 <w:rFonts w:ascii="仿宋" w:eastAsia="仿宋" w:hAnsi="仿宋" w:hint="eastAsia"/>
@@ -6362,7 +6362,7 @@
                 <w:szCs w:val="24"/>
               </w:rPr>
             </w:pPr>
-            <w:bookmarkStart w:id="36" w:name="lp_impl_operation_demonstration_student_activity"/>
+            <w:bookmarkStart w:id="36" w:name="lp_impl_demo_student"/>
             <w:r>
               <w:rPr>
                 <w:rFonts w:ascii="仿宋" w:eastAsia="仿宋" w:hAnsi="仿宋" w:hint="eastAsia"/>
@@ -6481,7 +6481,7 @@
                 <w:szCs w:val="24"/>
               </w:rPr>
             </w:pPr>
-            <w:bookmarkStart w:id="37" w:name="lp_impl_operation_demonstration_objective"/>
+            <w:bookmarkStart w:id="37" w:name="lp_impl_demo_goal"/>
             <w:r>
               <w:rPr>
                 <w:rFonts w:ascii="仿宋" w:eastAsia="仿宋" w:hAnsi="仿宋" w:hint="eastAsia"/>
@@ -6575,7 +6575,7 @@
                 <w:szCs w:val="24"/>
               </w:rPr>
             </w:pPr>
-            <w:bookmarkStart w:id="38" w:name="lp_impl_task_implementation_stage"/>
+            <w:bookmarkStart w:id="38" w:name="lp_impl_exec_stage"/>
             <w:r>
               <w:rPr>
                 <w:rFonts w:ascii="仿宋" w:eastAsia="仿宋" w:hAnsi="仿宋" w:hint="eastAsia"/>
@@ -6649,7 +6649,7 @@
                 <w:szCs w:val="24"/>
               </w:rPr>
             </w:pPr>
-            <w:bookmarkStart w:id="39" w:name="lp_impl_task_implementation_content"/>
+            <w:bookmarkStart w:id="39" w:name="lp_impl_exec_content"/>
             <w:r>
               <w:rPr>
                 <w:rFonts w:ascii="仿宋" w:eastAsia="仿宋" w:hAnsi="仿宋" w:hint="eastAsia"/>
@@ -6754,7 +6754,7 @@
                 <w:szCs w:val="24"/>
               </w:rPr>
             </w:pPr>
-            <w:bookmarkStart w:id="40" w:name="lp_impl_task_implementation_teacher_activity"/>
+            <w:bookmarkStart w:id="40" w:name="lp_impl_exec_teacher"/>
             <w:r>
               <w:rPr>
                 <w:rFonts w:ascii="仿宋" w:eastAsia="仿宋" w:hAnsi="仿宋" w:hint="eastAsia"/>
@@ -6870,7 +6870,7 @@
                 <w:szCs w:val="24"/>
               </w:rPr>
             </w:pPr>
-            <w:bookmarkStart w:id="41" w:name="lp_impl_task_implementation_student_activity"/>
+            <w:bookmarkStart w:id="41" w:name="lp_impl_exec_student"/>
             <w:r>
               <w:rPr>
                 <w:rFonts w:ascii="仿宋" w:eastAsia="仿宋" w:hAnsi="仿宋" w:hint="eastAsia"/>
@@ -7025,7 +7025,7 @@
                 <w:szCs w:val="24"/>
               </w:rPr>
             </w:pPr>
-            <w:bookmarkStart w:id="42" w:name="lp_impl_task_implementation_objective"/>
+            <w:bookmarkStart w:id="42" w:name="lp_impl_exec_goal"/>
             <w:r>
               <w:rPr>
                 <w:rFonts w:ascii="仿宋" w:eastAsia="仿宋" w:hAnsi="仿宋" w:hint="eastAsia"/>
@@ -7134,7 +7134,7 @@
                 <w:szCs w:val="24"/>
               </w:rPr>
             </w:pPr>
-            <w:bookmarkStart w:id="43" w:name="lp_impl_task_extension_stage"/>
+            <w:bookmarkStart w:id="43" w:name="lp_impl_extend_stage"/>
             <w:r>
               <w:rPr>
                 <w:rFonts w:ascii="仿宋" w:eastAsia="仿宋" w:hAnsi="仿宋" w:hint="eastAsia"/>
@@ -7208,7 +7208,7 @@
                 <w:szCs w:val="24"/>
               </w:rPr>
             </w:pPr>
-            <w:bookmarkStart w:id="44" w:name="lp_impl_task_extension_content"/>
+            <w:bookmarkStart w:id="44" w:name="lp_impl_extend_content"/>
             <w:r>
               <w:rPr>
                 <w:rFonts w:ascii="仿宋" w:eastAsia="仿宋" w:hAnsi="仿宋" w:hint="eastAsia"/>
@@ -7380,7 +7380,7 @@
                 <w:szCs w:val="24"/>
               </w:rPr>
             </w:pPr>
-            <w:bookmarkStart w:id="45" w:name="lp_impl_task_extension_teacher_activity"/>
+            <w:bookmarkStart w:id="45" w:name="lp_impl_extend_teacher"/>
             <w:r>
               <w:rPr>
                 <w:rFonts w:ascii="仿宋" w:eastAsia="仿宋" w:hAnsi="仿宋" w:hint="eastAsia"/>
@@ -7491,7 +7491,7 @@
                 <w:szCs w:val="24"/>
               </w:rPr>
             </w:pPr>
-            <w:bookmarkStart w:id="46" w:name="lp_impl_task_extension_student_activity"/>
+            <w:bookmarkStart w:id="46" w:name="lp_impl_extend_student"/>
             <w:r>
               <w:rPr>
                 <w:rFonts w:ascii="仿宋" w:eastAsia="仿宋" w:hAnsi="仿宋" w:hint="eastAsia"/>
@@ -7653,7 +7653,7 @@
                 <w:szCs w:val="24"/>
               </w:rPr>
             </w:pPr>
-            <w:bookmarkStart w:id="47" w:name="lp_impl_task_extension_objective"/>
+            <w:bookmarkStart w:id="47" w:name="lp_impl_extend_goal"/>
             <w:r>
               <w:rPr>
                 <w:rFonts w:ascii="仿宋" w:eastAsia="仿宋" w:hAnsi="仿宋" w:hint="eastAsia"/>
@@ -7723,7 +7723,7 @@
                 <w:szCs w:val="24"/>
               </w:rPr>
             </w:pPr>
-            <w:bookmarkStart w:id="48" w:name="lp_impl_project_practice_stage"/>
+            <w:bookmarkStart w:id="48" w:name="lp_impl_practice_stage"/>
             <w:r>
               <w:rPr>
                 <w:rFonts w:ascii="仿宋" w:eastAsia="仿宋" w:hAnsi="仿宋" w:hint="eastAsia"/>
@@ -7809,7 +7809,7 @@
                 <w:szCs w:val="24"/>
               </w:rPr>
             </w:pPr>
-            <w:bookmarkStart w:id="49" w:name="lp_impl_project_practice_content"/>
+            <w:bookmarkStart w:id="49" w:name="lp_impl_practice_content"/>
             <w:r>
               <w:rPr>
                 <w:rFonts w:ascii="仿宋" w:eastAsia="仿宋" w:hAnsi="仿宋" w:hint="eastAsia"/>
@@ -7942,7 +7942,7 @@
                 <w:szCs w:val="24"/>
               </w:rPr>
             </w:pPr>
-            <w:bookmarkStart w:id="50" w:name="lp_impl_project_practice_teacher_activity"/>
+            <w:bookmarkStart w:id="50" w:name="lp_impl_practice_teacher"/>
             <w:r>
               <w:rPr>
                 <w:rFonts w:ascii="仿宋" w:eastAsia="仿宋" w:hAnsi="仿宋" w:hint="eastAsia"/>
@@ -8032,7 +8032,7 @@
                 <w:szCs w:val="24"/>
               </w:rPr>
             </w:pPr>
-            <w:bookmarkStart w:id="51" w:name="lp_impl_project_practice_student_activity"/>
+            <w:bookmarkStart w:id="51" w:name="lp_impl_practice_student"/>
             <w:r>
               <w:rPr>
                 <w:rFonts w:ascii="仿宋" w:eastAsia="仿宋" w:hAnsi="仿宋" w:hint="eastAsia"/>
@@ -8121,7 +8121,7 @@
                 <w:szCs w:val="24"/>
               </w:rPr>
             </w:pPr>
-            <w:bookmarkStart w:id="52" w:name="lp_impl_project_practice_objective"/>
+            <w:bookmarkStart w:id="52" w:name="lp_impl_practice_goal"/>
             <w:r>
               <w:rPr>
                 <w:rFonts w:ascii="仿宋" w:eastAsia="仿宋" w:hAnsi="仿宋" w:hint="eastAsia"/>
@@ -8161,7 +8161,7 @@
                 <w:szCs w:val="24"/>
               </w:rPr>
             </w:pPr>
-            <w:bookmarkStart w:id="53" w:name="lp_impl_peer_review_stage"/>
+            <w:bookmarkStart w:id="53" w:name="lp_impl_peer_stage"/>
             <w:r>
               <w:rPr>
                 <w:rFonts w:ascii="仿宋" w:eastAsia="仿宋" w:hAnsi="仿宋" w:hint="eastAsia"/>
@@ -8241,7 +8241,7 @@
                 <w:szCs w:val="24"/>
               </w:rPr>
             </w:pPr>
-            <w:bookmarkStart w:id="54" w:name="lp_impl_peer_review_content"/>
+            <w:bookmarkStart w:id="54" w:name="lp_impl_peer_content"/>
             <w:r>
               <w:rPr>
                 <w:rFonts w:ascii="仿宋" w:eastAsia="仿宋" w:hAnsi="仿宋" w:hint="eastAsia"/>
@@ -8277,7 +8277,7 @@
                 <w:szCs w:val="24"/>
               </w:rPr>
             </w:pPr>
-            <w:bookmarkStart w:id="55" w:name="lp_impl_peer_review_teacher_activity"/>
+            <w:bookmarkStart w:id="55" w:name="lp_impl_peer_teacher"/>
             <w:r>
               <w:rPr>
                 <w:rFonts w:ascii="仿宋" w:eastAsia="仿宋" w:hAnsi="仿宋" w:hint="eastAsia"/>
@@ -8330,7 +8330,7 @@
                 <w:szCs w:val="24"/>
               </w:rPr>
             </w:pPr>
-            <w:bookmarkStart w:id="56" w:name="lp_impl_peer_review_student_activity"/>
+            <w:bookmarkStart w:id="56" w:name="lp_impl_peer_student"/>
             <w:r>
               <w:rPr>
                 <w:rFonts w:ascii="仿宋" w:eastAsia="仿宋" w:hAnsi="仿宋" w:hint="eastAsia"/>
@@ -8365,7 +8365,7 @@
                 <w:szCs w:val="24"/>
               </w:rPr>
             </w:pPr>
-            <w:bookmarkStart w:id="57" w:name="lp_impl_peer_review_objective"/>
+            <w:bookmarkStart w:id="57" w:name="lp_impl_peer_goal"/>
             <w:r>
               <w:rPr>
                 <w:rFonts w:ascii="仿宋" w:eastAsia="仿宋" w:hAnsi="仿宋" w:hint="eastAsia"/>
@@ -8406,7 +8406,7 @@
                 <w:szCs w:val="24"/>
               </w:rPr>
             </w:pPr>
-            <w:bookmarkStart w:id="58" w:name="lp_impl_lesson_summary_stage"/>
+            <w:bookmarkStart w:id="58" w:name="lp_impl_summary_stage"/>
             <w:r>
               <w:rPr>
                 <w:rFonts w:ascii="仿宋" w:eastAsia="仿宋" w:hAnsi="仿宋" w:hint="eastAsia"/>
@@ -8473,7 +8473,7 @@
                 <w:szCs w:val="24"/>
               </w:rPr>
             </w:pPr>
-            <w:bookmarkStart w:id="59" w:name="lp_impl_lesson_summary_content"/>
+            <w:bookmarkStart w:id="59" w:name="lp_impl_summary_content"/>
             <w:r>
               <w:rPr>
                 <w:rFonts w:ascii="仿宋" w:eastAsia="仿宋" w:hAnsi="仿宋" w:hint="eastAsia"/>
@@ -8510,7 +8510,7 @@
                 <w:szCs w:val="24"/>
               </w:rPr>
             </w:pPr>
-            <w:bookmarkStart w:id="60" w:name="lp_impl_lesson_summary_teacher_activity"/>
+            <w:bookmarkStart w:id="60" w:name="lp_impl_summary_teacher"/>
             <w:r>
               <w:rPr>
                 <w:rFonts w:ascii="仿宋" w:eastAsia="仿宋" w:hAnsi="仿宋" w:hint="eastAsia"/>
@@ -8603,7 +8603,7 @@
                 <w:szCs w:val="24"/>
               </w:rPr>
             </w:pPr>
-            <w:bookmarkStart w:id="61" w:name="lp_impl_lesson_summary_student_activity"/>
+            <w:bookmarkStart w:id="61" w:name="lp_impl_summary_student"/>
             <w:r>
               <w:rPr>
                 <w:rFonts w:ascii="仿宋" w:eastAsia="仿宋" w:hAnsi="仿宋" w:hint="eastAsia"/>
@@ -8659,7 +8659,7 @@
                 <w:szCs w:val="24"/>
               </w:rPr>
             </w:pPr>
-            <w:bookmarkStart w:id="62" w:name="lp_impl_lesson_summary_objective"/>
+            <w:bookmarkStart w:id="62" w:name="lp_impl_summary_goal"/>
             <w:r>
               <w:rPr>
                 <w:rFonts w:ascii="仿宋" w:eastAsia="仿宋" w:hAnsi="仿宋" w:hint="eastAsia"/>
@@ -8757,7 +8757,7 @@
                 <w:szCs w:val="24"/>
               </w:rPr>
             </w:pPr>
-            <w:bookmarkStart w:id="63" w:name="lp_impl_after_class_improvement_stage"/>
+            <w:bookmarkStart w:id="63" w:name="lp_impl_improve_stage"/>
             <w:r>
               <w:rPr>
                 <w:rFonts w:ascii="仿宋" w:eastAsia="仿宋" w:hAnsi="仿宋" w:hint="eastAsia"/>
@@ -8830,7 +8830,7 @@
                 <w:szCs w:val="24"/>
               </w:rPr>
             </w:pPr>
-            <w:bookmarkStart w:id="64" w:name="lp_impl_after_class_improvement_content"/>
+            <w:bookmarkStart w:id="64" w:name="lp_impl_improve_content"/>
             <w:proofErr w:type="gramStart"/>
             <w:r>
               <w:rPr>
@@ -8913,7 +8913,7 @@
                 <w:szCs w:val="24"/>
               </w:rPr>
             </w:pPr>
-            <w:bookmarkStart w:id="65" w:name="lp_impl_after_class_improvement_teacher_activity"/>
+            <w:bookmarkStart w:id="65" w:name="lp_impl_improve_teacher"/>
             <w:r>
               <w:rPr>
                 <w:rFonts w:ascii="仿宋" w:eastAsia="仿宋" w:hAnsi="仿宋" w:hint="eastAsia"/>
@@ -8970,7 +8970,7 @@
                 <w:szCs w:val="24"/>
               </w:rPr>
             </w:pPr>
-            <w:bookmarkStart w:id="66" w:name="lp_impl_after_class_improvement_student_activity"/>
+            <w:bookmarkStart w:id="66" w:name="lp_impl_improve_student"/>
             <w:r>
               <w:rPr>
                 <w:rFonts w:ascii="仿宋" w:eastAsia="仿宋" w:hAnsi="仿宋" w:hint="eastAsia"/>
@@ -9021,7 +9021,7 @@
                 <w:szCs w:val="24"/>
               </w:rPr>
             </w:pPr>
-            <w:bookmarkStart w:id="67" w:name="lp_impl_after_class_improvement_objective"/>
+            <w:bookmarkStart w:id="67" w:name="lp_impl_improve_goal"/>
             <w:r>
               <w:rPr>
                 <w:rFonts w:ascii="仿宋" w:eastAsia="仿宋" w:hAnsi="仿宋" w:hint="eastAsia"/>

</xml_diff>